<commit_message>
update word add github link
</commit_message>
<xml_diff>
--- a/Bao_cao_M1_DangMinhTai_23110148.docx
+++ b/Bao_cao_M1_DangMinhTai_23110148.docx
@@ -303,19 +303,6 @@
     </w:p>
     <w:p>
       <w:pPr>
-        <w:spacing w:before="240"/>
-        <w:jc w:val="center"/>
-        <w:rPr>
-          <w:rFonts w:cs="Times New Roman"/>
-          <w:b/>
-          <w:bCs/>
-          <w:szCs w:val="26"/>
-          <w:lang w:val="vi-VN"/>
-        </w:rPr>
-      </w:pPr>
-    </w:p>
-    <w:p>
-      <w:pPr>
         <w:jc w:val="center"/>
         <w:rPr>
           <w:rFonts w:cs="Times New Roman"/>
@@ -333,6 +320,48 @@
         </w:rPr>
         <w:t>NHẬN DẠNG HOẠT ĐỘNG VÀ ƯỚC LƯỢNG NHỊP TIM TRÊN PPG DALIA</w:t>
       </w:r>
+    </w:p>
+    <w:p>
+      <w:pPr>
+        <w:rPr>
+          <w:rFonts w:cs="Times New Roman"/>
+          <w:b/>
+          <w:szCs w:val="26"/>
+          <w:lang w:val="en-US"/>
+        </w:rPr>
+      </w:pPr>
+      <w:r>
+        <w:rPr>
+          <w:rFonts w:cs="Times New Roman"/>
+          <w:b/>
+          <w:szCs w:val="26"/>
+          <w:lang w:val="en-US"/>
+        </w:rPr>
+        <w:tab/>
+        <w:t xml:space="preserve">Link Github: </w:t>
+      </w:r>
+      <w:hyperlink r:id="rId9" w:history="1">
+        <w:r>
+          <w:rPr>
+            <w:rStyle w:val="Hyperlink"/>
+            <w:rFonts w:cs="Times New Roman"/>
+            <w:b/>
+            <w:szCs w:val="26"/>
+            <w:lang w:val="en-US"/>
+          </w:rPr>
+          <w:t>https://github.com/dangminhtai/M1_PPG_DaLiA_23110148</w:t>
+        </w:r>
+      </w:hyperlink>
+    </w:p>
+    <w:p>
+      <w:pPr>
+        <w:rPr>
+          <w:rFonts w:cs="Times New Roman"/>
+          <w:b/>
+          <w:szCs w:val="26"/>
+          <w:lang w:val="en-US"/>
+        </w:rPr>
+      </w:pPr>
     </w:p>
     <w:p>
       <w:pPr>
@@ -492,21 +521,14 @@
     <w:p>
       <w:pPr>
         <w:pStyle w:val="Heading1"/>
-        <w:keepNext/>
-        <w:keepLines/>
-        <w:widowControl/>
-        <w:spacing w:before="240" w:after="120" w:line="264" w:lineRule="auto"/>
-        <w:ind w:left="0" w:right="0" w:firstLine="0"/>
-        <w:jc w:val="left"/>
+        <w:spacing w:after="120" w:line="264" w:lineRule="auto"/>
+        <w:ind w:firstLine="0"/>
       </w:pPr>
       <w:r>
         <w:rPr>
-          <w:rFonts w:ascii="Times New Roman" w:hAnsi="Times New Roman" w:eastAsia="Times New Roman"/>
-          <w:b/>
-          <w:i w:val="0"/>
+          <w:rFonts w:eastAsia="Times New Roman"/>
           <w:color w:val="000000"/>
           <w:sz w:val="30"/>
-          <w:u w:val="none"/>
         </w:rPr>
         <w:t>1 Mục tiêu và phạm vi</w:t>
       </w:r>
@@ -538,21 +560,14 @@
     <w:p>
       <w:pPr>
         <w:pStyle w:val="Heading1"/>
-        <w:keepNext/>
-        <w:keepLines/>
-        <w:widowControl/>
-        <w:spacing w:before="240" w:after="120" w:line="264" w:lineRule="auto"/>
-        <w:ind w:left="0" w:right="0" w:firstLine="0"/>
-        <w:jc w:val="left"/>
+        <w:spacing w:after="120" w:line="264" w:lineRule="auto"/>
+        <w:ind w:firstLine="0"/>
       </w:pPr>
       <w:r>
         <w:rPr>
-          <w:rFonts w:ascii="Times New Roman" w:hAnsi="Times New Roman" w:eastAsia="Times New Roman"/>
-          <w:b/>
-          <w:i w:val="0"/>
+          <w:rFonts w:eastAsia="Times New Roman"/>
           <w:color w:val="000000"/>
           <w:sz w:val="30"/>
-          <w:u w:val="none"/>
         </w:rPr>
         <w:t>2 Dữ liệu và cơ sở phương pháp</w:t>
       </w:r>
@@ -560,21 +575,13 @@
     <w:p>
       <w:pPr>
         <w:pStyle w:val="Heading2"/>
-        <w:keepNext/>
-        <w:keepLines/>
-        <w:widowControl/>
-        <w:spacing w:before="160" w:after="120" w:line="264" w:lineRule="auto"/>
-        <w:ind w:left="0" w:right="0" w:firstLine="0"/>
-        <w:jc w:val="left"/>
+        <w:spacing w:after="120" w:line="264" w:lineRule="auto"/>
+        <w:ind w:firstLine="0"/>
       </w:pPr>
       <w:r>
         <w:rPr>
-          <w:rFonts w:ascii="Times New Roman" w:hAnsi="Times New Roman" w:eastAsia="Times New Roman"/>
-          <w:b/>
-          <w:i w:val="0"/>
+          <w:rFonts w:eastAsia="Times New Roman"/>
           <w:color w:val="000000"/>
-          <w:sz w:val="26"/>
-          <w:u w:val="none"/>
         </w:rPr>
         <w:t>2.1 PPG DaLiA và nhãn tham chiếu</w:t>
       </w:r>
@@ -598,21 +605,13 @@
     <w:p>
       <w:pPr>
         <w:pStyle w:val="Heading2"/>
-        <w:keepNext/>
-        <w:keepLines/>
-        <w:widowControl/>
-        <w:spacing w:before="160" w:after="120" w:line="264" w:lineRule="auto"/>
-        <w:ind w:left="0" w:right="0" w:firstLine="0"/>
-        <w:jc w:val="left"/>
+        <w:spacing w:after="120" w:line="264" w:lineRule="auto"/>
+        <w:ind w:firstLine="0"/>
       </w:pPr>
       <w:r>
         <w:rPr>
-          <w:rFonts w:ascii="Times New Roman" w:hAnsi="Times New Roman" w:eastAsia="Times New Roman"/>
-          <w:b/>
-          <w:i w:val="0"/>
+          <w:rFonts w:eastAsia="Times New Roman"/>
           <w:color w:val="000000"/>
-          <w:sz w:val="26"/>
-          <w:u w:val="none"/>
         </w:rPr>
         <w:t>2.2 Lựa chọn mô hình</w:t>
       </w:r>
@@ -628,21 +627,14 @@
     <w:p>
       <w:pPr>
         <w:pStyle w:val="Heading1"/>
-        <w:keepNext/>
-        <w:keepLines/>
-        <w:widowControl/>
-        <w:spacing w:before="240" w:after="120" w:line="264" w:lineRule="auto"/>
-        <w:ind w:left="0" w:right="0" w:firstLine="0"/>
-        <w:jc w:val="left"/>
+        <w:spacing w:after="120" w:line="264" w:lineRule="auto"/>
+        <w:ind w:firstLine="0"/>
       </w:pPr>
       <w:r>
         <w:rPr>
-          <w:rFonts w:ascii="Times New Roman" w:hAnsi="Times New Roman" w:eastAsia="Times New Roman"/>
-          <w:b/>
-          <w:i w:val="0"/>
+          <w:rFonts w:eastAsia="Times New Roman"/>
           <w:color w:val="000000"/>
           <w:sz w:val="30"/>
-          <w:u w:val="none"/>
         </w:rPr>
         <w:lastRenderedPageBreak/>
         <w:t>3 Thiết kế thực nghiệm</w:t>
@@ -651,21 +643,13 @@
     <w:p>
       <w:pPr>
         <w:pStyle w:val="Heading2"/>
-        <w:keepNext/>
-        <w:keepLines/>
-        <w:widowControl/>
-        <w:spacing w:before="160" w:after="120" w:line="264" w:lineRule="auto"/>
-        <w:ind w:left="0" w:right="0" w:firstLine="0"/>
-        <w:jc w:val="left"/>
+        <w:spacing w:after="120" w:line="264" w:lineRule="auto"/>
+        <w:ind w:firstLine="0"/>
       </w:pPr>
       <w:r>
         <w:rPr>
-          <w:rFonts w:ascii="Times New Roman" w:hAnsi="Times New Roman" w:eastAsia="Times New Roman"/>
-          <w:b/>
-          <w:i w:val="0"/>
+          <w:rFonts w:eastAsia="Times New Roman"/>
           <w:color w:val="000000"/>
-          <w:sz w:val="26"/>
-          <w:u w:val="none"/>
         </w:rPr>
         <w:t>3.1 Tiền xử lý và phân bố cửa sổ</w:t>
       </w:r>
@@ -2172,21 +2156,13 @@
     <w:p>
       <w:pPr>
         <w:pStyle w:val="Heading2"/>
-        <w:keepNext/>
-        <w:keepLines/>
-        <w:widowControl/>
-        <w:spacing w:before="160" w:after="120" w:line="264" w:lineRule="auto"/>
-        <w:ind w:left="0" w:right="0" w:firstLine="0"/>
-        <w:jc w:val="left"/>
+        <w:spacing w:after="120" w:line="264" w:lineRule="auto"/>
+        <w:ind w:firstLine="0"/>
       </w:pPr>
       <w:r>
         <w:rPr>
-          <w:rFonts w:ascii="Times New Roman" w:hAnsi="Times New Roman" w:eastAsia="Times New Roman"/>
-          <w:b/>
-          <w:i w:val="0"/>
+          <w:rFonts w:eastAsia="Times New Roman"/>
           <w:color w:val="000000"/>
-          <w:sz w:val="26"/>
-          <w:u w:val="none"/>
         </w:rPr>
         <w:t>3.2 Chia tập và chuẩn hóa</w:t>
       </w:r>
@@ -3018,21 +2994,13 @@
     <w:p>
       <w:pPr>
         <w:pStyle w:val="Heading2"/>
-        <w:keepNext/>
-        <w:keepLines/>
-        <w:widowControl/>
-        <w:spacing w:before="160" w:after="120" w:line="264" w:lineRule="auto"/>
-        <w:ind w:left="0" w:right="0" w:firstLine="0"/>
-        <w:jc w:val="left"/>
+        <w:spacing w:after="120" w:line="264" w:lineRule="auto"/>
+        <w:ind w:firstLine="0"/>
       </w:pPr>
       <w:r>
         <w:rPr>
-          <w:rFonts w:ascii="Times New Roman" w:hAnsi="Times New Roman" w:eastAsia="Times New Roman"/>
-          <w:b/>
-          <w:i w:val="0"/>
+          <w:rFonts w:eastAsia="Times New Roman"/>
           <w:color w:val="000000"/>
-          <w:sz w:val="26"/>
-          <w:u w:val="none"/>
         </w:rPr>
         <w:t>3.3 Kiến trúc và các đối chuẩn</w:t>
       </w:r>
@@ -3946,21 +3914,13 @@
     <w:p>
       <w:pPr>
         <w:pStyle w:val="Heading2"/>
-        <w:keepNext/>
-        <w:keepLines/>
-        <w:widowControl/>
-        <w:spacing w:before="160" w:after="120" w:line="264" w:lineRule="auto"/>
-        <w:ind w:left="0" w:right="0" w:firstLine="0"/>
-        <w:jc w:val="left"/>
+        <w:spacing w:after="120" w:line="264" w:lineRule="auto"/>
+        <w:ind w:firstLine="0"/>
       </w:pPr>
       <w:r>
         <w:rPr>
-          <w:rFonts w:ascii="Times New Roman" w:hAnsi="Times New Roman" w:eastAsia="Times New Roman"/>
-          <w:b/>
-          <w:i w:val="0"/>
+          <w:rFonts w:eastAsia="Times New Roman"/>
           <w:color w:val="000000"/>
-          <w:sz w:val="26"/>
-          <w:u w:val="none"/>
         </w:rPr>
         <w:t>3.4 Huấn luyện và lựa chọn mô hình</w:t>
       </w:r>
@@ -5983,21 +5943,13 @@
     <w:p>
       <w:pPr>
         <w:pStyle w:val="Heading2"/>
-        <w:keepNext/>
-        <w:keepLines/>
-        <w:widowControl/>
-        <w:spacing w:before="160" w:after="120" w:line="264" w:lineRule="auto"/>
-        <w:ind w:left="0" w:right="0" w:firstLine="0"/>
-        <w:jc w:val="left"/>
+        <w:spacing w:after="120" w:line="264" w:lineRule="auto"/>
+        <w:ind w:firstLine="0"/>
       </w:pPr>
       <w:r>
         <w:rPr>
-          <w:rFonts w:ascii="Times New Roman" w:hAnsi="Times New Roman" w:eastAsia="Times New Roman"/>
-          <w:b/>
-          <w:i w:val="0"/>
+          <w:rFonts w:eastAsia="Times New Roman"/>
           <w:color w:val="000000"/>
-          <w:sz w:val="26"/>
-          <w:u w:val="none"/>
         </w:rPr>
         <w:t>3.5 Thiết kế thí nghiệm D E F</w:t>
       </w:r>
@@ -7025,21 +6977,13 @@
     <w:p>
       <w:pPr>
         <w:pStyle w:val="Heading2"/>
-        <w:keepNext/>
-        <w:keepLines/>
-        <w:widowControl/>
-        <w:spacing w:before="160" w:after="120" w:line="264" w:lineRule="auto"/>
-        <w:ind w:left="0" w:right="0" w:firstLine="0"/>
-        <w:jc w:val="left"/>
+        <w:spacing w:after="120" w:line="264" w:lineRule="auto"/>
+        <w:ind w:firstLine="0"/>
       </w:pPr>
       <w:r>
         <w:rPr>
-          <w:rFonts w:ascii="Times New Roman" w:hAnsi="Times New Roman" w:eastAsia="Times New Roman"/>
-          <w:b/>
-          <w:i w:val="0"/>
+          <w:rFonts w:eastAsia="Times New Roman"/>
           <w:color w:val="000000"/>
-          <w:sz w:val="26"/>
-          <w:u w:val="none"/>
         </w:rPr>
         <w:t>3.6 Chỉ số đánh giá</w:t>
       </w:r>
@@ -7063,21 +7007,14 @@
     <w:p>
       <w:pPr>
         <w:pStyle w:val="Heading1"/>
-        <w:keepNext/>
-        <w:keepLines/>
-        <w:widowControl/>
-        <w:spacing w:before="240" w:after="120" w:line="264" w:lineRule="auto"/>
-        <w:ind w:left="0" w:right="0" w:firstLine="0"/>
-        <w:jc w:val="left"/>
+        <w:spacing w:after="120" w:line="264" w:lineRule="auto"/>
+        <w:ind w:firstLine="0"/>
       </w:pPr>
       <w:r>
         <w:rPr>
-          <w:rFonts w:ascii="Times New Roman" w:hAnsi="Times New Roman" w:eastAsia="Times New Roman"/>
-          <w:b/>
-          <w:i w:val="0"/>
+          <w:rFonts w:eastAsia="Times New Roman"/>
           <w:color w:val="000000"/>
           <w:sz w:val="30"/>
-          <w:u w:val="none"/>
         </w:rPr>
         <w:t>4 Kết quả và phân tích</w:t>
       </w:r>
@@ -7085,21 +7022,13 @@
     <w:p>
       <w:pPr>
         <w:pStyle w:val="Heading2"/>
-        <w:keepNext/>
-        <w:keepLines/>
-        <w:widowControl/>
-        <w:spacing w:before="160" w:after="120" w:line="264" w:lineRule="auto"/>
-        <w:ind w:left="0" w:right="0" w:firstLine="0"/>
-        <w:jc w:val="left"/>
+        <w:spacing w:after="120" w:line="264" w:lineRule="auto"/>
+        <w:ind w:firstLine="0"/>
       </w:pPr>
       <w:r>
         <w:rPr>
-          <w:rFonts w:ascii="Times New Roman" w:hAnsi="Times New Roman" w:eastAsia="Times New Roman"/>
-          <w:b/>
-          <w:i w:val="0"/>
+          <w:rFonts w:eastAsia="Times New Roman"/>
           <w:color w:val="000000"/>
-          <w:sz w:val="26"/>
-          <w:u w:val="none"/>
         </w:rPr>
         <w:t>4.1 Ước lượng nhịp tim</w:t>
       </w:r>
@@ -11270,21 +11199,13 @@
     <w:p>
       <w:pPr>
         <w:pStyle w:val="Heading2"/>
-        <w:keepNext/>
-        <w:keepLines/>
-        <w:widowControl/>
-        <w:spacing w:before="160" w:after="120" w:line="264" w:lineRule="auto"/>
-        <w:ind w:left="0" w:right="0" w:firstLine="0"/>
-        <w:jc w:val="left"/>
+        <w:spacing w:after="120" w:line="264" w:lineRule="auto"/>
+        <w:ind w:firstLine="0"/>
       </w:pPr>
       <w:r>
         <w:rPr>
-          <w:rFonts w:ascii="Times New Roman" w:hAnsi="Times New Roman" w:eastAsia="Times New Roman"/>
-          <w:b/>
-          <w:i w:val="0"/>
+          <w:rFonts w:eastAsia="Times New Roman"/>
           <w:color w:val="000000"/>
-          <w:sz w:val="26"/>
-          <w:u w:val="none"/>
         </w:rPr>
         <w:t>4.2 Nhận dạng hoạt động</w:t>
       </w:r>
@@ -13204,21 +13125,13 @@
     <w:p>
       <w:pPr>
         <w:pStyle w:val="Heading2"/>
-        <w:keepNext/>
-        <w:keepLines/>
-        <w:widowControl/>
-        <w:spacing w:before="160" w:after="120" w:line="264" w:lineRule="auto"/>
-        <w:ind w:left="0" w:right="0" w:firstLine="0"/>
-        <w:jc w:val="left"/>
+        <w:spacing w:after="120" w:line="264" w:lineRule="auto"/>
+        <w:ind w:firstLine="0"/>
       </w:pPr>
       <w:r>
         <w:rPr>
-          <w:rFonts w:ascii="Times New Roman" w:hAnsi="Times New Roman" w:eastAsia="Times New Roman"/>
-          <w:b/>
-          <w:i w:val="0"/>
+          <w:rFonts w:eastAsia="Times New Roman"/>
           <w:color w:val="000000"/>
-          <w:sz w:val="26"/>
-          <w:u w:val="none"/>
         </w:rPr>
         <w:lastRenderedPageBreak/>
         <w:t>4.3 Nhầm lẫn giữa các hoạt động</w:t>
@@ -13249,7 +13162,7 @@
                     <pic:cNvPicPr/>
                   </pic:nvPicPr>
                   <pic:blipFill>
-                    <a:blip r:embed="rId9"/>
+                    <a:blip r:embed="rId10"/>
                     <a:stretch>
                       <a:fillRect/>
                     </a:stretch>
@@ -13297,21 +13210,13 @@
     <w:p>
       <w:pPr>
         <w:pStyle w:val="Heading2"/>
-        <w:keepNext/>
-        <w:keepLines/>
-        <w:widowControl/>
-        <w:spacing w:before="160" w:after="120" w:line="264" w:lineRule="auto"/>
-        <w:ind w:left="0" w:right="0" w:firstLine="0"/>
-        <w:jc w:val="left"/>
+        <w:spacing w:after="120" w:line="264" w:lineRule="auto"/>
+        <w:ind w:firstLine="0"/>
       </w:pPr>
       <w:r>
         <w:rPr>
-          <w:rFonts w:ascii="Times New Roman" w:hAnsi="Times New Roman" w:eastAsia="Times New Roman"/>
-          <w:b/>
-          <w:i w:val="0"/>
+          <w:rFonts w:eastAsia="Times New Roman"/>
           <w:color w:val="000000"/>
-          <w:sz w:val="26"/>
-          <w:u w:val="none"/>
         </w:rPr>
         <w:lastRenderedPageBreak/>
         <w:t>4.4 Kết quả theo từng lượt</w:t>
@@ -14323,21 +14228,13 @@
     <w:p>
       <w:pPr>
         <w:pStyle w:val="Heading2"/>
-        <w:keepNext/>
-        <w:keepLines/>
-        <w:widowControl/>
-        <w:spacing w:before="160" w:after="120" w:line="264" w:lineRule="auto"/>
-        <w:ind w:left="0" w:right="0" w:firstLine="0"/>
-        <w:jc w:val="left"/>
+        <w:spacing w:after="120" w:line="264" w:lineRule="auto"/>
+        <w:ind w:firstLine="0"/>
       </w:pPr>
       <w:r>
         <w:rPr>
-          <w:rFonts w:ascii="Times New Roman" w:hAnsi="Times New Roman" w:eastAsia="Times New Roman"/>
-          <w:b/>
-          <w:i w:val="0"/>
+          <w:rFonts w:eastAsia="Times New Roman"/>
           <w:color w:val="000000"/>
-          <w:sz w:val="26"/>
-          <w:u w:val="none"/>
         </w:rPr>
         <w:t>4.5 Quá trình huấn luyện</w:t>
       </w:r>
@@ -14367,7 +14264,7 @@
                     <pic:cNvPicPr/>
                   </pic:nvPicPr>
                   <pic:blipFill>
-                    <a:blip r:embed="rId10"/>
+                    <a:blip r:embed="rId11"/>
                     <a:stretch>
                       <a:fillRect/>
                     </a:stretch>
@@ -14407,21 +14304,13 @@
     <w:p>
       <w:pPr>
         <w:pStyle w:val="Heading2"/>
-        <w:keepNext/>
-        <w:keepLines/>
-        <w:widowControl/>
-        <w:spacing w:before="160" w:after="120" w:line="264" w:lineRule="auto"/>
-        <w:ind w:left="0" w:right="0" w:firstLine="0"/>
-        <w:jc w:val="left"/>
+        <w:spacing w:after="120" w:line="264" w:lineRule="auto"/>
+        <w:ind w:firstLine="0"/>
       </w:pPr>
       <w:r>
         <w:rPr>
-          <w:rFonts w:ascii="Times New Roman" w:hAnsi="Times New Roman" w:eastAsia="Times New Roman"/>
-          <w:b/>
-          <w:i w:val="0"/>
+          <w:rFonts w:eastAsia="Times New Roman"/>
           <w:color w:val="000000"/>
-          <w:sz w:val="26"/>
-          <w:u w:val="none"/>
         </w:rPr>
         <w:lastRenderedPageBreak/>
         <w:t>4.6 Kết quả thí nghiệm D E F</w:t>
@@ -21185,7 +21074,7 @@
                     <pic:cNvPicPr/>
                   </pic:nvPicPr>
                   <pic:blipFill>
-                    <a:blip r:embed="rId11"/>
+                    <a:blip r:embed="rId12"/>
                     <a:stretch>
                       <a:fillRect/>
                     </a:stretch>
@@ -21217,21 +21106,14 @@
     <w:p>
       <w:pPr>
         <w:pStyle w:val="Heading1"/>
-        <w:keepNext/>
-        <w:keepLines/>
-        <w:widowControl/>
-        <w:spacing w:before="240" w:after="120" w:line="264" w:lineRule="auto"/>
-        <w:ind w:left="0" w:right="0" w:firstLine="0"/>
-        <w:jc w:val="left"/>
+        <w:spacing w:after="120" w:line="264" w:lineRule="auto"/>
+        <w:ind w:firstLine="0"/>
       </w:pPr>
       <w:r>
         <w:rPr>
-          <w:rFonts w:ascii="Times New Roman" w:hAnsi="Times New Roman" w:eastAsia="Times New Roman"/>
-          <w:b/>
-          <w:i w:val="0"/>
+          <w:rFonts w:eastAsia="Times New Roman"/>
           <w:color w:val="000000"/>
           <w:sz w:val="30"/>
-          <w:u w:val="none"/>
         </w:rPr>
         <w:t>5 Tài nguyên và khả năng ứng dụng</w:t>
       </w:r>
@@ -22099,21 +21981,13 @@
     <w:p>
       <w:pPr>
         <w:pStyle w:val="Heading2"/>
-        <w:keepNext/>
-        <w:keepLines/>
-        <w:widowControl/>
-        <w:spacing w:before="160" w:after="120" w:line="264" w:lineRule="auto"/>
-        <w:ind w:left="0" w:right="0" w:firstLine="0"/>
-        <w:jc w:val="left"/>
+        <w:spacing w:after="120" w:line="264" w:lineRule="auto"/>
+        <w:ind w:firstLine="0"/>
       </w:pPr>
       <w:r>
         <w:rPr>
-          <w:rFonts w:ascii="Times New Roman" w:hAnsi="Times New Roman" w:eastAsia="Times New Roman"/>
-          <w:b/>
-          <w:i w:val="0"/>
+          <w:rFonts w:eastAsia="Times New Roman"/>
           <w:color w:val="000000"/>
-          <w:sz w:val="26"/>
-          <w:u w:val="none"/>
         </w:rPr>
         <w:t>5.1 Đo các biến thể trong cùng phiên bổ sung</w:t>
       </w:r>
@@ -23132,21 +23006,14 @@
     <w:p>
       <w:pPr>
         <w:pStyle w:val="Heading1"/>
-        <w:keepNext/>
-        <w:keepLines/>
-        <w:widowControl/>
-        <w:spacing w:before="240" w:after="120" w:line="264" w:lineRule="auto"/>
-        <w:ind w:left="0" w:right="0" w:firstLine="0"/>
-        <w:jc w:val="left"/>
+        <w:spacing w:after="120" w:line="264" w:lineRule="auto"/>
+        <w:ind w:firstLine="0"/>
       </w:pPr>
       <w:r>
         <w:rPr>
-          <w:rFonts w:ascii="Times New Roman" w:hAnsi="Times New Roman" w:eastAsia="Times New Roman"/>
-          <w:b/>
-          <w:i w:val="0"/>
+          <w:rFonts w:eastAsia="Times New Roman"/>
           <w:color w:val="000000"/>
           <w:sz w:val="30"/>
-          <w:u w:val="none"/>
         </w:rPr>
         <w:t>6 Đối chiếu phạm vi và giới hạn</w:t>
       </w:r>
@@ -24183,21 +24050,14 @@
     <w:p>
       <w:pPr>
         <w:pStyle w:val="Heading1"/>
-        <w:keepNext/>
-        <w:keepLines/>
-        <w:widowControl/>
-        <w:spacing w:before="240" w:after="120" w:line="264" w:lineRule="auto"/>
-        <w:ind w:left="0" w:right="0" w:firstLine="0"/>
-        <w:jc w:val="left"/>
+        <w:spacing w:after="120" w:line="264" w:lineRule="auto"/>
+        <w:ind w:firstLine="0"/>
       </w:pPr>
       <w:r>
         <w:rPr>
-          <w:rFonts w:ascii="Times New Roman" w:hAnsi="Times New Roman" w:eastAsia="Times New Roman"/>
-          <w:b/>
-          <w:i w:val="0"/>
+          <w:rFonts w:eastAsia="Times New Roman"/>
           <w:color w:val="000000"/>
           <w:sz w:val="30"/>
-          <w:u w:val="none"/>
         </w:rPr>
         <w:t>7 Kết luận</w:t>
       </w:r>
@@ -24218,21 +24078,14 @@
     <w:p>
       <w:pPr>
         <w:pStyle w:val="Heading1"/>
-        <w:keepNext/>
-        <w:keepLines/>
-        <w:widowControl/>
-        <w:spacing w:before="240" w:after="120" w:line="264" w:lineRule="auto"/>
-        <w:ind w:left="0" w:right="0" w:firstLine="0"/>
-        <w:jc w:val="left"/>
+        <w:spacing w:after="120" w:line="264" w:lineRule="auto"/>
+        <w:ind w:firstLine="0"/>
       </w:pPr>
       <w:r>
         <w:rPr>
-          <w:rFonts w:ascii="Times New Roman" w:hAnsi="Times New Roman" w:eastAsia="Times New Roman"/>
-          <w:b/>
-          <w:i w:val="0"/>
+          <w:rFonts w:eastAsia="Times New Roman"/>
           <w:color w:val="000000"/>
           <w:sz w:val="30"/>
-          <w:u w:val="none"/>
         </w:rPr>
         <w:lastRenderedPageBreak/>
         <w:t>Tài liệu tham khảo</w:t>
@@ -24257,26 +24110,21 @@
     <w:p>
       <w:pPr>
         <w:keepLines/>
+        <w:rPr>
+          <w:lang w:val="en-US"/>
+        </w:rPr>
       </w:pPr>
       <w:r>
         <w:t>[3] A. Reiss, I. Indlekofer, P. Schmidt và K. Van Laerhoven, “Deep PPG: Large-Scale Heart Rate Estimation with Convolutional Neural Networks,” Sensors, tập 19, số 14, bài 3079, 2019. DOI: 10.3390/s19143079.</w:t>
       </w:r>
     </w:p>
-    <w:p>
-      <w:pPr>
-        <w:rPr>
-          <w:rFonts w:cs="Times New Roman"/>
-          <w:szCs w:val="26"/>
-        </w:rPr>
-      </w:pPr>
-    </w:p>
     <w:sectPr>
-      <w:headerReference w:type="even" r:id="rId12"/>
-      <w:headerReference w:type="default" r:id="rId13"/>
-      <w:footerReference w:type="even" r:id="rId14"/>
-      <w:footerReference w:type="default" r:id="rId15"/>
-      <w:headerReference w:type="first" r:id="rId16"/>
-      <w:footerReference w:type="first" r:id="rId17"/>
+      <w:headerReference w:type="even" r:id="rId13"/>
+      <w:headerReference w:type="default" r:id="rId14"/>
+      <w:footerReference w:type="even" r:id="rId15"/>
+      <w:footerReference w:type="default" r:id="rId16"/>
+      <w:headerReference w:type="first" r:id="rId17"/>
+      <w:footerReference w:type="first" r:id="rId18"/>
       <w:pgSz w:w="11907" w:h="16840" w:code="9"/>
       <w:pgMar w:top="1134" w:right="1134" w:bottom="1134" w:left="1701" w:header="720" w:footer="720" w:gutter="0"/>
       <w:pgBorders w:display="firstPage">
@@ -25184,6 +25032,7 @@
   <w:style w:type="character" w:default="1" w:styleId="DefaultParagraphFont">
     <w:name w:val="Default Paragraph Font"/>
     <w:uiPriority w:val="1"/>
+    <w:semiHidden/>
     <w:unhideWhenUsed/>
   </w:style>
   <w:style w:type="table" w:default="1" w:styleId="TableNormal">

</xml_diff>